<commit_message>
Geschichte 8: Lückentext ohne überzählige Wörter
Co-Authored-By: Claude Sonnet 5.5 <noreply@anthropic.com>
Claude-Session: https://claude.ai/code/session_01CtRuNVyt8v9M882BKEmgNb
</commit_message>
<xml_diff>
--- a/Geschichte_8/Absolutismus_Wiederholung/Arbeitsblatt_Lueckentext_Fuenf_Saeulen.docx
+++ b/Geschichte_8/Absolutismus_Wiederholung/Arbeitsblatt_Lueckentext_Fuenf_Saeulen.docx
@@ -56,18 +56,7 @@
           <w:sz w:val="22"/>
           <w:szCs w:val="22"/>
         </w:rPr>
-        <w:t xml:space="preserve">Lies den Text einmal ganz. Ergänze dann die Lücken mit dem Wortspeicher und streiche jedes benutzte Wort durch. </w:t>
-      </w:r>
-      <w:r>
-        <w:rPr>
-          <w:rFonts w:ascii="Calibri" w:cs="Calibri" w:eastAsia="Calibri" w:hAnsi="Calibri"/>
-          <w:b/>
-          <w:bCs/>
-          <w:color w:val="000000"/>
-          <w:sz w:val="22"/>
-          <w:szCs w:val="22"/>
-        </w:rPr>
-        <w:t xml:space="preserve">Zwei Wörter passen nicht.</w:t>
+        <w:t xml:space="preserve">Lies den Text einmal ganz. Ergänze dann die Lücken mit dem Wortspeicher und streiche jedes benutzte Wort durch.</w:t>
       </w:r>
     </w:p>
     <w:tbl>
@@ -134,7 +123,7 @@
                 <w:sz w:val="23"/>
                 <w:szCs w:val="23"/>
               </w:rPr>
-              <w:t xml:space="preserve">Beamte   ·   Glaube   ·   Söldner   ·   Merkantilismus   ·   Gottesgnadentum   ·   Versailles   ·   Steuerfreiheit   ·   Zölle   ·   stehendes   ·   400.000   ·   Drittel   ·   absoluter   ·   Intendanten   ·   Parlament</w:t>
+              <w:t xml:space="preserve">Beamte   ·   Glaube   ·   Merkantilismus   ·   Gottesgnadentum   ·   Versailles   ·   Steuerfreiheit   ·   Zölle   ·   stehendes   ·   400.000   ·   Drittel   ·   absoluter   ·   Intendanten</w:t>
             </w:r>
           </w:p>
         </w:tc>

</xml_diff>